<commit_message>
Cambios informe gestrion estructura
</commit_message>
<xml_diff>
--- a/storage/templates/informe_final_gestion.docx
+++ b/storage/templates/informe_final_gestion.docx
@@ -1,6 +1,6 @@
 
 <file path=word/document.xml><?xml version="1.0" encoding="utf-8"?>
-<w:document xmlns:wpc="http://schemas.microsoft.com/office/word/2010/wordprocessingCanvas" xmlns:cx="http://schemas.microsoft.com/office/drawing/2014/chartex" xmlns:cx1="http://schemas.microsoft.com/office/drawing/2015/9/8/chartex" xmlns:cx2="http://schemas.microsoft.com/office/drawing/2015/10/21/chartex" xmlns:cx3="http://schemas.microsoft.com/office/drawing/2016/5/9/chartex" xmlns:cx4="http://schemas.microsoft.com/office/drawing/2016/5/10/chartex" xmlns:cx5="http://schemas.microsoft.com/office/drawing/2016/5/11/chartex" xmlns:cx6="http://schemas.microsoft.com/office/drawing/2016/5/12/chartex" xmlns:cx7="http://schemas.microsoft.com/office/drawing/2016/5/13/chartex" xmlns:cx8="http://schemas.microsoft.com/office/drawing/2016/5/14/chartex" xmlns:mc="http://schemas.openxmlformats.org/markup-compatibility/2006" xmlns:aink="http://schemas.microsoft.com/office/drawing/2016/ink" xmlns:am3d="http://schemas.microsoft.com/office/drawing/2017/model3d" xmlns:o="urn:schemas-microsoft-com:office:office" xmlns:oel="http://schemas.microsoft.com/office/2019/extlst" xmlns:r="http://schemas.openxmlformats.org/officeDocument/2006/relationships" xmlns:m="http://schemas.openxmlformats.org/officeDocument/2006/math" xmlns:v="urn:schemas-microsoft-com:vml" xmlns:wp14="http://schemas.microsoft.com/office/word/2010/wordprocessingDrawing" xmlns:wp="http://schemas.openxmlformats.org/drawingml/2006/wordprocessingDrawing" xmlns:w10="urn:schemas-microsoft-com:office:word" xmlns:w="http://schemas.openxmlformats.org/wordprocessingml/2006/main" xmlns:w14="http://schemas.microsoft.com/office/word/2010/wordml" xmlns:w15="http://schemas.microsoft.com/office/word/2012/wordml" xmlns:w16cex="http://schemas.microsoft.com/office/word/2018/wordml/cex" xmlns:w16cid="http://schemas.microsoft.com/office/word/2016/wordml/cid" xmlns:w16="http://schemas.microsoft.com/office/word/2018/wordml" xmlns:w16du="http://schemas.microsoft.com/office/word/2023/wordml/word16du" xmlns:w16sdtdh="http://schemas.microsoft.com/office/word/2020/wordml/sdtdatahash" xmlns:w16sdtfl="http://schemas.microsoft.com/office/word/2024/wordml/sdtformatlock" xmlns:w16se="http://schemas.microsoft.com/office/word/2015/wordml/symex" xmlns:wpg="http://schemas.microsoft.com/office/word/2010/wordprocessingGroup" xmlns:wpi="http://schemas.microsoft.com/office/word/2010/wordprocessingInk" xmlns:wne="http://schemas.microsoft.com/office/word/2006/wordml" xmlns:wps="http://schemas.microsoft.com/office/word/2010/wordprocessingShape" mc:Ignorable="w14 w15 w16se w16cid w16 w16cex w16sdtdh w16sdtfl w16du wp14">
+<w:document xmlns:wpc="http://schemas.microsoft.com/office/word/2010/wordprocessingCanvas" xmlns:cx="http://schemas.microsoft.com/office/drawing/2014/chartex" xmlns:cx1="http://schemas.microsoft.com/office/drawing/2015/9/8/chartex" xmlns:cx2="http://schemas.microsoft.com/office/drawing/2015/10/21/chartex" xmlns:cx3="http://schemas.microsoft.com/office/drawing/2016/5/9/chartex" xmlns:cx4="http://schemas.microsoft.com/office/drawing/2016/5/10/chartex" xmlns:cx5="http://schemas.microsoft.com/office/drawing/2016/5/11/chartex" xmlns:cx6="http://schemas.microsoft.com/office/drawing/2016/5/12/chartex" xmlns:cx7="http://schemas.microsoft.com/office/drawing/2016/5/13/chartex" xmlns:cx8="http://schemas.microsoft.com/office/drawing/2016/5/14/chartex" xmlns:mc="http://schemas.openxmlformats.org/markup-compatibility/2006" xmlns:aink="http://schemas.microsoft.com/office/drawing/2016/ink" xmlns:am3d="http://schemas.microsoft.com/office/drawing/2017/model3d" xmlns:o="urn:schemas-microsoft-com:office:office" xmlns:r="http://schemas.openxmlformats.org/officeDocument/2006/relationships" xmlns:m="http://schemas.openxmlformats.org/officeDocument/2006/math" xmlns:v="urn:schemas-microsoft-com:vml" xmlns:wp14="http://schemas.microsoft.com/office/word/2010/wordprocessingDrawing" xmlns:wp="http://schemas.openxmlformats.org/drawingml/2006/wordprocessingDrawing" xmlns:w10="urn:schemas-microsoft-com:office:word" xmlns:w="http://schemas.openxmlformats.org/wordprocessingml/2006/main" xmlns:w14="http://schemas.microsoft.com/office/word/2010/wordml" xmlns:w15="http://schemas.microsoft.com/office/word/2012/wordml" xmlns:w16cex="http://schemas.microsoft.com/office/word/2018/wordml/cex" xmlns:w16cid="http://schemas.microsoft.com/office/word/2016/wordml/cid" xmlns:w16="http://schemas.microsoft.com/office/word/2018/wordml" xmlns:w16sdtdh="http://schemas.microsoft.com/office/word/2020/wordml/sdtdatahash" xmlns:w16se="http://schemas.microsoft.com/office/word/2015/wordml/symex" xmlns:wpg="http://schemas.microsoft.com/office/word/2010/wordprocessingGroup" xmlns:wpi="http://schemas.microsoft.com/office/word/2010/wordprocessingInk" xmlns:wne="http://schemas.microsoft.com/office/word/2006/wordml" xmlns:wps="http://schemas.microsoft.com/office/word/2010/wordprocessingShape" mc:Ignorable="w14 w15 w16se w16cid w16 w16cex w16sdtdh wp14">
   <w:body>
     <w:p>
       <w:pPr>
@@ -281,24 +281,31 @@
         <w:shd w:val="clear" w:color="auto" w:fill="auto"/>
         <w:spacing w:after="0"/>
         <w:ind w:left="21"/>
-        <w:rPr>
-          <w:rFonts w:ascii="Arial Rounded MT Bold" w:hAnsi="Arial Rounded MT Bold"/>
-        </w:rPr>
-      </w:pPr>
-      <w:r>
+        <w:jc w:val="center"/>
         <w:rPr>
           <w:rFonts w:ascii="Arial Rounded MT Bold" w:hAnsi="Arial Rounded MT Bold"/>
           <w:color w:val="000000"/>
         </w:rPr>
-        <w:t xml:space="preserve">Introducción </w:t>
-      </w:r>
-    </w:p>
-    <w:p>
-      <w:pPr>
-        <w:rPr>
-          <w:rFonts w:ascii="Arial Rounded MT Bold" w:hAnsi="Arial Rounded MT Bold"/>
-        </w:rPr>
-      </w:pPr>
+      </w:pPr>
+    </w:p>
+    <w:p>
+      <w:pPr>
+        <w:pStyle w:val="Ttulo1"/>
+        <w:shd w:val="clear" w:color="auto" w:fill="auto"/>
+        <w:spacing w:after="0"/>
+        <w:ind w:left="21"/>
+        <w:jc w:val="center"/>
+        <w:rPr>
+          <w:rFonts w:ascii="Arial Rounded MT Bold" w:hAnsi="Arial Rounded MT Bold"/>
+        </w:rPr>
+      </w:pPr>
+      <w:r>
+        <w:rPr>
+          <w:rFonts w:ascii="Arial Rounded MT Bold" w:hAnsi="Arial Rounded MT Bold"/>
+          <w:color w:val="000000"/>
+        </w:rPr>
+        <w:t>INTRODUCCIÓN</w:t>
+      </w:r>
     </w:p>
     <w:p>
       <w:pPr>
@@ -384,54 +391,53 @@
     </w:p>
     <w:p>
       <w:pPr>
-        <w:spacing w:after="0"/>
-        <w:ind w:left="21"/>
-        <w:rPr>
-          <w:rFonts w:ascii="Arial Rounded MT Bold" w:eastAsia="Arial" w:hAnsi="Arial Rounded MT Bold" w:cs="Arial"/>
+        <w:rPr>
+          <w:rFonts w:ascii="Arial Rounded MT Bold" w:hAnsi="Arial Rounded MT Bold"/>
           <w:b/>
-          <w:lang w:val="es-CO"/>
-        </w:rPr>
-      </w:pPr>
-      <w:r>
-        <w:rPr>
-          <w:rFonts w:ascii="Arial Rounded MT Bold" w:eastAsia="Arial" w:hAnsi="Arial Rounded MT Bold" w:cs="Arial"/>
+          <w:bCs/>
+          <w:lang w:val="es-CO"/>
+        </w:rPr>
+      </w:pPr>
+      <w:r>
+        <w:rPr>
+          <w:rFonts w:ascii="Arial Rounded MT Bold" w:hAnsi="Arial Rounded MT Bold"/>
           <w:b/>
-          <w:lang w:val="es-CO"/>
-        </w:rPr>
-        <w:t>RESUMEN EJECUTIVO</w:t>
-      </w:r>
-    </w:p>
-    <w:p>
-      <w:pPr>
-        <w:spacing w:after="0"/>
-        <w:ind w:left="21"/>
-        <w:rPr>
-          <w:rFonts w:ascii="Arial Rounded MT Bold" w:eastAsia="Arial" w:hAnsi="Arial Rounded MT Bold" w:cs="Arial"/>
-          <w:b/>
-          <w:lang w:val="es-CO"/>
-        </w:rPr>
-      </w:pPr>
-    </w:p>
-    <w:p>
-      <w:pPr>
-        <w:pStyle w:val="Prrafodelista"/>
-        <w:spacing w:after="0"/>
-        <w:ind w:left="381"/>
-        <w:rPr>
-          <w:rFonts w:ascii="Arial Rounded MT Bold" w:eastAsia="Arial" w:hAnsi="Arial Rounded MT Bold" w:cs="Arial"/>
-          <w:bCs/>
-          <w:lang w:val="es-CO"/>
-        </w:rPr>
-      </w:pPr>
-      <w:r>
-        <w:rPr>
-          <w:rFonts w:ascii="Arial Rounded MT Bold" w:eastAsia="Arial" w:hAnsi="Arial Rounded MT Bold" w:cs="Arial"/>
           <w:bCs/>
           <w:highlight w:val="cyan"/>
           <w:lang w:val="es-CO"/>
         </w:rPr>
-        <w:t>${RESUMEN_EJECUTIVO_HINT}</w:t>
-      </w:r>
+        <w:t xml:space="preserve">ANALISIS DE </w:t>
+      </w:r>
+      <w:r>
+        <w:rPr>
+          <w:rFonts w:ascii="Arial Rounded MT Bold" w:hAnsi="Arial Rounded MT Bold"/>
+          <w:b/>
+          <w:bCs/>
+          <w:highlight w:val="cyan"/>
+          <w:lang w:val="es-CO"/>
+        </w:rPr>
+        <w:t xml:space="preserve">RESULTADO DE </w:t>
+      </w:r>
+      <w:r>
+        <w:rPr>
+          <w:rFonts w:ascii="Arial Rounded MT Bold" w:hAnsi="Arial Rounded MT Bold"/>
+          <w:b/>
+          <w:bCs/>
+          <w:highlight w:val="cyan"/>
+          <w:lang w:val="es-CO"/>
+        </w:rPr>
+        <w:t>PRETEST Y POSTEST</w:t>
+      </w:r>
+    </w:p>
+    <w:p>
+      <w:pPr>
+        <w:rPr>
+          <w:rFonts w:ascii="Arial Rounded MT Bold" w:hAnsi="Arial Rounded MT Bold"/>
+          <w:b/>
+          <w:bCs/>
+          <w:lang w:val="es-CO"/>
+        </w:rPr>
+      </w:pPr>
     </w:p>
     <w:p>
       <w:pPr>
@@ -596,10 +602,10 @@
     </w:p>
     <w:p>
       <w:pPr>
-        <w:spacing w:after="0"/>
-        <w:ind w:left="21"/>
-        <w:rPr>
-          <w:rFonts w:ascii="Arial Rounded MT Bold" w:hAnsi="Arial Rounded MT Bold"/>
+        <w:rPr>
+          <w:rFonts w:ascii="Arial Rounded MT Bold" w:hAnsi="Arial Rounded MT Bold"/>
+          <w:b/>
+          <w:bCs/>
           <w:lang w:val="es-CO"/>
         </w:rPr>
       </w:pPr>
@@ -609,7 +615,15 @@
           <w:b/>
           <w:lang w:val="es-CO"/>
         </w:rPr>
-        <w:t xml:space="preserve">ASESORÍAS Y ASISTENCIAS TÉCNICAS REALIZADAS AL MUNICIPIO:  </w:t>
+        <w:t>ASESORÍAS Y ASISTENCIAS TÉCNICAS REALIZADAS AL MUNICIPIO</w:t>
+      </w:r>
+      <w:r>
+        <w:rPr>
+          <w:rFonts w:ascii="Arial Rounded MT Bold" w:eastAsia="Arial" w:hAnsi="Arial Rounded MT Bold" w:cs="Arial"/>
+          <w:b/>
+          <w:lang w:val="es-CO"/>
+        </w:rPr>
+        <w:t xml:space="preserve"> </w:t>
       </w:r>
     </w:p>
     <w:p>
@@ -646,23 +660,13 @@
                 <w:lang w:val="es-CO"/>
               </w:rPr>
             </w:pPr>
-            <w:proofErr w:type="gramStart"/>
             <w:r>
               <w:rPr>
                 <w:rFonts w:ascii="Arial Rounded MT Bold" w:hAnsi="Arial Rounded MT Bold"/>
                 <w:highlight w:val="yellow"/>
                 <w:lang w:val="es-CO"/>
               </w:rPr>
-              <w:t>TOTAL</w:t>
-            </w:r>
-            <w:proofErr w:type="gramEnd"/>
-            <w:r>
-              <w:rPr>
-                <w:rFonts w:ascii="Arial Rounded MT Bold" w:hAnsi="Arial Rounded MT Bold"/>
-                <w:highlight w:val="yellow"/>
-                <w:lang w:val="es-CO"/>
-              </w:rPr>
-              <w:t xml:space="preserve"> ASESORIAS REALIZADAS</w:t>
+              <w:t>TOTAL ASESORIAS REALIZADAS</w:t>
             </w:r>
           </w:p>
         </w:tc>
@@ -680,23 +684,13 @@
                 <w:lang w:val="es-CO"/>
               </w:rPr>
             </w:pPr>
-            <w:proofErr w:type="gramStart"/>
             <w:r>
               <w:rPr>
                 <w:rFonts w:ascii="Arial Rounded MT Bold" w:hAnsi="Arial Rounded MT Bold"/>
                 <w:highlight w:val="yellow"/>
                 <w:lang w:val="es-CO"/>
               </w:rPr>
-              <w:t>TOTAL</w:t>
-            </w:r>
-            <w:proofErr w:type="gramEnd"/>
-            <w:r>
-              <w:rPr>
-                <w:rFonts w:ascii="Arial Rounded MT Bold" w:hAnsi="Arial Rounded MT Bold"/>
-                <w:highlight w:val="yellow"/>
-                <w:lang w:val="es-CO"/>
-              </w:rPr>
-              <w:t xml:space="preserve"> ASISTENCIAS TECNICAS REALIZADAS</w:t>
+              <w:t>TOTAL ASISTENCIAS TECNICAS REALIZADAS</w:t>
             </w:r>
           </w:p>
         </w:tc>
@@ -788,16 +782,12 @@
       <w:pPr>
         <w:rPr>
           <w:rFonts w:ascii="Arial Rounded MT Bold" w:hAnsi="Arial Rounded MT Bold"/>
-          <w:b/>
-          <w:bCs/>
-          <w:lang w:val="es-CO"/>
-        </w:rPr>
-      </w:pPr>
-      <w:r>
-        <w:rPr>
-          <w:rFonts w:ascii="Arial Rounded MT Bold" w:hAnsi="Arial Rounded MT Bold"/>
-          <w:b/>
-          <w:bCs/>
+          <w:lang w:val="es-CO"/>
+        </w:rPr>
+      </w:pPr>
+      <w:r>
+        <w:rPr>
+          <w:rFonts w:ascii="Arial Rounded MT Bold" w:hAnsi="Arial Rounded MT Bold"/>
           <w:lang w:val="es-CO"/>
         </w:rPr>
         <w:t>POBLACIÓN IMPACTADA</w:t>
@@ -818,11 +808,9 @@
         <w:tc>
           <w:tcPr>
             <w:tcW w:w="3116" w:type="dxa"/>
-            <w:vAlign w:val="center"/>
           </w:tcPr>
           <w:p>
             <w:pPr>
-              <w:jc w:val="center"/>
               <w:rPr>
                 <w:rFonts w:ascii="Arial Rounded MT Bold" w:hAnsi="Arial Rounded MT Bold"/>
                 <w:highlight w:val="yellow"/>
@@ -842,11 +830,9 @@
         <w:tc>
           <w:tcPr>
             <w:tcW w:w="3117" w:type="dxa"/>
-            <w:vAlign w:val="center"/>
           </w:tcPr>
           <w:p>
             <w:pPr>
-              <w:jc w:val="center"/>
               <w:rPr>
                 <w:rFonts w:ascii="Arial Rounded MT Bold" w:hAnsi="Arial Rounded MT Bold"/>
                 <w:highlight w:val="yellow"/>
@@ -866,11 +852,9 @@
         <w:tc>
           <w:tcPr>
             <w:tcW w:w="3117" w:type="dxa"/>
-            <w:vAlign w:val="center"/>
           </w:tcPr>
           <w:p>
             <w:pPr>
-              <w:jc w:val="center"/>
               <w:rPr>
                 <w:rFonts w:ascii="Arial Rounded MT Bold" w:hAnsi="Arial Rounded MT Bold"/>
                 <w:highlight w:val="yellow"/>
@@ -885,6 +869,15 @@
               </w:rPr>
               <w:t>TEMATICA GENERAL</w:t>
             </w:r>
+          </w:p>
+          <w:p>
+            <w:pPr>
+              <w:rPr>
+                <w:rFonts w:ascii="Arial Rounded MT Bold" w:hAnsi="Arial Rounded MT Bold"/>
+                <w:highlight w:val="yellow"/>
+                <w:lang w:val="es-CO"/>
+              </w:rPr>
+            </w:pPr>
           </w:p>
         </w:tc>
       </w:tr>
@@ -963,273 +956,22 @@
           <w:bCs/>
           <w:lang w:val="es-CO"/>
         </w:rPr>
-        <w:t>ANALISIS CUALITATIVO DE LA IMPLEMENTACION</w:t>
-      </w:r>
-    </w:p>
-    <w:tbl>
-      <w:tblPr>
-        <w:tblStyle w:val="Tablaconcuadrcula"/>
-        <w:tblW w:w="0" w:type="auto"/>
-        <w:tblLook w:val="04A0" w:firstRow="1" w:lastRow="0" w:firstColumn="1" w:lastColumn="0" w:noHBand="0" w:noVBand="1"/>
-      </w:tblPr>
-      <w:tblGrid>
-        <w:gridCol w:w="4675"/>
-        <w:gridCol w:w="4675"/>
-      </w:tblGrid>
-      <w:tr>
-        <w:tc>
-          <w:tcPr>
-            <w:tcW w:w="4675" w:type="dxa"/>
-          </w:tcPr>
-          <w:p>
-            <w:pPr>
-              <w:rPr>
-                <w:rFonts w:ascii="Arial Rounded MT Bold" w:hAnsi="Arial Rounded MT Bold"/>
-                <w:highlight w:val="cyan"/>
-                <w:lang w:val="es-CO"/>
-              </w:rPr>
-            </w:pPr>
-            <w:r>
-              <w:rPr>
-                <w:rFonts w:ascii="Arial Rounded MT Bold" w:hAnsi="Arial Rounded MT Bold"/>
-                <w:highlight w:val="cyan"/>
-                <w:lang w:val="es-CO"/>
-              </w:rPr>
-              <w:t>DEBILIDADES</w:t>
-            </w:r>
-          </w:p>
-        </w:tc>
-        <w:tc>
-          <w:tcPr>
-            <w:tcW w:w="4675" w:type="dxa"/>
-          </w:tcPr>
-          <w:p>
-            <w:pPr>
-              <w:rPr>
-                <w:rFonts w:ascii="Arial Rounded MT Bold" w:hAnsi="Arial Rounded MT Bold"/>
-                <w:highlight w:val="cyan"/>
-                <w:lang w:val="es-CO"/>
-              </w:rPr>
-            </w:pPr>
-          </w:p>
-        </w:tc>
-      </w:tr>
-      <w:tr>
-        <w:tc>
-          <w:tcPr>
-            <w:tcW w:w="4675" w:type="dxa"/>
-          </w:tcPr>
-          <w:p>
-            <w:pPr>
-              <w:rPr>
-                <w:rFonts w:ascii="Arial Rounded MT Bold" w:hAnsi="Arial Rounded MT Bold"/>
-                <w:highlight w:val="cyan"/>
-                <w:lang w:val="es-CO"/>
-              </w:rPr>
-            </w:pPr>
-            <w:r>
-              <w:rPr>
-                <w:rFonts w:ascii="Arial Rounded MT Bold" w:hAnsi="Arial Rounded MT Bold"/>
-                <w:highlight w:val="cyan"/>
-                <w:lang w:val="es-CO"/>
-              </w:rPr>
-              <w:t>OPORTUNIDADES</w:t>
-            </w:r>
-          </w:p>
-        </w:tc>
-        <w:tc>
-          <w:tcPr>
-            <w:tcW w:w="4675" w:type="dxa"/>
-          </w:tcPr>
-          <w:p>
-            <w:pPr>
-              <w:rPr>
-                <w:rFonts w:ascii="Arial Rounded MT Bold" w:hAnsi="Arial Rounded MT Bold"/>
-                <w:highlight w:val="cyan"/>
-                <w:lang w:val="es-CO"/>
-              </w:rPr>
-            </w:pPr>
-          </w:p>
-        </w:tc>
-      </w:tr>
-      <w:tr>
-        <w:tc>
-          <w:tcPr>
-            <w:tcW w:w="4675" w:type="dxa"/>
-          </w:tcPr>
-          <w:p>
-            <w:pPr>
-              <w:rPr>
-                <w:rFonts w:ascii="Arial Rounded MT Bold" w:hAnsi="Arial Rounded MT Bold"/>
-                <w:highlight w:val="cyan"/>
-                <w:lang w:val="es-CO"/>
-              </w:rPr>
-            </w:pPr>
-            <w:r>
-              <w:rPr>
-                <w:rFonts w:ascii="Arial Rounded MT Bold" w:hAnsi="Arial Rounded MT Bold"/>
-                <w:highlight w:val="cyan"/>
-                <w:lang w:val="es-CO"/>
-              </w:rPr>
-              <w:t>FORTALEZAS</w:t>
-            </w:r>
-          </w:p>
-        </w:tc>
-        <w:tc>
-          <w:tcPr>
-            <w:tcW w:w="4675" w:type="dxa"/>
-          </w:tcPr>
-          <w:p>
-            <w:pPr>
-              <w:rPr>
-                <w:rFonts w:ascii="Arial Rounded MT Bold" w:hAnsi="Arial Rounded MT Bold"/>
-                <w:highlight w:val="cyan"/>
-                <w:lang w:val="es-CO"/>
-              </w:rPr>
-            </w:pPr>
-          </w:p>
-        </w:tc>
-      </w:tr>
-      <w:tr>
-        <w:tc>
-          <w:tcPr>
-            <w:tcW w:w="4675" w:type="dxa"/>
-          </w:tcPr>
-          <w:p>
-            <w:pPr>
-              <w:rPr>
-                <w:rFonts w:ascii="Arial Rounded MT Bold" w:hAnsi="Arial Rounded MT Bold"/>
-                <w:highlight w:val="cyan"/>
-                <w:lang w:val="es-CO"/>
-              </w:rPr>
-            </w:pPr>
-            <w:proofErr w:type="gramStart"/>
-            <w:r>
-              <w:rPr>
-                <w:rFonts w:ascii="Arial Rounded MT Bold" w:hAnsi="Arial Rounded MT Bold"/>
-                <w:highlight w:val="cyan"/>
-                <w:lang w:val="es-CO"/>
-              </w:rPr>
-              <w:t>ASPECTOS A MEJORAR</w:t>
-            </w:r>
-            <w:proofErr w:type="gramEnd"/>
-          </w:p>
-        </w:tc>
-        <w:tc>
-          <w:tcPr>
-            <w:tcW w:w="4675" w:type="dxa"/>
-          </w:tcPr>
-          <w:p>
-            <w:pPr>
-              <w:rPr>
-                <w:rFonts w:ascii="Arial Rounded MT Bold" w:hAnsi="Arial Rounded MT Bold"/>
-                <w:highlight w:val="cyan"/>
-                <w:lang w:val="es-CO"/>
-              </w:rPr>
-            </w:pPr>
-          </w:p>
-        </w:tc>
-      </w:tr>
-    </w:tbl>
-    <w:p>
-      <w:pPr>
-        <w:rPr>
-          <w:rFonts w:ascii="Arial Rounded MT Bold" w:hAnsi="Arial Rounded MT Bold"/>
-          <w:lang w:val="es-CO"/>
-        </w:rPr>
-      </w:pPr>
-    </w:p>
-    <w:p>
-      <w:pPr>
-        <w:rPr>
-          <w:rFonts w:ascii="Arial Rounded MT Bold" w:hAnsi="Arial Rounded MT Bold"/>
-          <w:lang w:val="es-CO"/>
-        </w:rPr>
-      </w:pPr>
-    </w:p>
-    <w:p>
-      <w:pPr>
-        <w:rPr>
-          <w:rFonts w:ascii="Arial Rounded MT Bold" w:hAnsi="Arial Rounded MT Bold"/>
-          <w:lang w:val="es-CO"/>
-        </w:rPr>
-      </w:pPr>
-    </w:p>
-    <w:p>
-      <w:pPr>
-        <w:rPr>
-          <w:rFonts w:ascii="Arial Rounded MT Bold" w:hAnsi="Arial Rounded MT Bold"/>
-          <w:lang w:val="es-CO"/>
-        </w:rPr>
-      </w:pPr>
-      <w:r>
-        <w:rPr>
-          <w:rFonts w:ascii="Arial Rounded MT Bold" w:hAnsi="Arial Rounded MT Bold"/>
-          <w:lang w:val="es-CO"/>
-        </w:rPr>
-        <w:t xml:space="preserve">CUMPLIMIENTO DEL OBJETO CONTRACTUAL </w:t>
-      </w:r>
-    </w:p>
-    <w:p>
-      <w:pPr>
-        <w:rPr>
-          <w:rFonts w:ascii="Arial Rounded MT Bold" w:hAnsi="Arial Rounded MT Bold"/>
-          <w:lang w:val="es-CO"/>
-        </w:rPr>
-      </w:pPr>
-      <w:r>
-        <w:rPr>
-          <w:rFonts w:ascii="Arial Rounded MT Bold" w:hAnsi="Arial Rounded MT Bold"/>
-          <w:highlight w:val="cyan"/>
-          <w:lang w:val="es-CO"/>
-        </w:rPr>
-        <w:t>(</w:t>
-      </w:r>
-      <w:r>
-        <w:rPr>
-          <w:rFonts w:ascii="Arial Rounded MT Bold" w:hAnsi="Arial Rounded MT Bold"/>
-          <w:highlight w:val="cyan"/>
-          <w:lang w:val="es-CO"/>
-        </w:rPr>
-        <w:t>Describir cómo cada actividad ejecutada contribuyó al cumplimiento de dicho objeto.)</w:t>
-      </w:r>
-    </w:p>
-    <w:p>
-      <w:pPr>
-        <w:rPr>
-          <w:rFonts w:ascii="Arial Rounded MT Bold" w:hAnsi="Arial Rounded MT Bold"/>
-          <w:lang w:val="es-CO"/>
-        </w:rPr>
-      </w:pPr>
-    </w:p>
-    <w:p>
-      <w:pPr>
-        <w:rPr>
-          <w:rFonts w:ascii="Arial Rounded MT Bold" w:hAnsi="Arial Rounded MT Bold"/>
-          <w:lang w:val="es-CO"/>
-        </w:rPr>
-      </w:pPr>
-      <w:r>
-        <w:rPr>
-          <w:rFonts w:ascii="Arial Rounded MT Bold" w:hAnsi="Arial Rounded MT Bold"/>
-          <w:lang w:val="es-CO"/>
-        </w:rPr>
-        <w:t>EVIDENCIAS ANEXAS</w:t>
-      </w:r>
-    </w:p>
-    <w:p>
-      <w:pPr>
-        <w:rPr>
-          <w:rFonts w:ascii="Arial Rounded MT Bold" w:hAnsi="Arial Rounded MT Bold"/>
-          <w:lang w:val="es-CO"/>
-        </w:rPr>
-      </w:pPr>
-      <w:r>
-        <w:rPr>
-          <w:rFonts w:ascii="Arial Rounded MT Bold" w:hAnsi="Arial Rounded MT Bold"/>
-          <w:lang w:val="es-CO"/>
-        </w:rPr>
-        <w:t>Incluir:</w:t>
+        <w:t>PLAN DE SOSTENIBILIDAD</w:t>
+      </w:r>
+    </w:p>
+    <w:p>
+      <w:pPr>
+        <w:rPr>
+          <w:rFonts w:ascii="Arial Rounded MT Bold" w:hAnsi="Arial Rounded MT Bold"/>
+          <w:lang w:val="es-CO"/>
+        </w:rPr>
+      </w:pPr>
+      <w:r>
+        <w:rPr>
+          <w:rFonts w:ascii="Arial Rounded MT Bold" w:hAnsi="Arial Rounded MT Bold"/>
+          <w:lang w:val="es-CO"/>
+        </w:rPr>
+        <w:t>Que capacidad instalada se deja:</w:t>
       </w:r>
     </w:p>
     <w:p>
@@ -1251,7 +993,39 @@
           <w:highlight w:val="cyan"/>
           <w:lang w:val="es-CO"/>
         </w:rPr>
-        <w:t>Listado de asistencias técnicas.</w:t>
+        <w:t>Insumos compartidos</w:t>
+      </w:r>
+      <w:r>
+        <w:rPr>
+          <w:rFonts w:ascii="Arial Rounded MT Bold" w:hAnsi="Arial Rounded MT Bold"/>
+          <w:highlight w:val="cyan"/>
+          <w:lang w:val="es-CO"/>
+        </w:rPr>
+        <w:t xml:space="preserve"> (ejemplo: compartimos las </w:t>
+      </w:r>
+      <w:r>
+        <w:rPr>
+          <w:rFonts w:ascii="Arial Rounded MT Bold" w:hAnsi="Arial Rounded MT Bold"/>
+          <w:highlight w:val="cyan"/>
+          <w:lang w:val="es-CO"/>
+        </w:rPr>
+        <w:t>guías</w:t>
+      </w:r>
+      <w:r>
+        <w:rPr>
+          <w:rFonts w:ascii="Arial Rounded MT Bold" w:hAnsi="Arial Rounded MT Bold"/>
+          <w:highlight w:val="cyan"/>
+          <w:lang w:val="es-CO"/>
+        </w:rPr>
+        <w:t>, los</w:t>
+      </w:r>
+      <w:r>
+        <w:rPr>
+          <w:rFonts w:ascii="Arial Rounded MT Bold" w:hAnsi="Arial Rounded MT Bold"/>
+          <w:highlight w:val="cyan"/>
+          <w:lang w:val="es-CO"/>
+        </w:rPr>
+        <w:t xml:space="preserve"> lineamientos, orientaciones, matrices, protocolos, bibliografías, presentaciones, videos, tamizajes)</w:t>
       </w:r>
     </w:p>
     <w:p>
@@ -1273,43 +1047,93 @@
           <w:highlight w:val="cyan"/>
           <w:lang w:val="es-CO"/>
         </w:rPr>
-        <w:t>Actas.</w:t>
-      </w:r>
-    </w:p>
-    <w:p>
-      <w:pPr>
-        <w:pStyle w:val="Prrafodelista"/>
-        <w:numPr>
-          <w:ilvl w:val="0"/>
-          <w:numId w:val="2"/>
-        </w:numPr>
+        <w:t>Responsables</w:t>
+      </w:r>
+    </w:p>
+    <w:p>
+      <w:pPr>
+        <w:rPr>
+          <w:rFonts w:ascii="Arial Rounded MT Bold" w:hAnsi="Arial Rounded MT Bold"/>
+          <w:b/>
+          <w:bCs/>
+          <w:lang w:val="es-CO"/>
+        </w:rPr>
+      </w:pPr>
+      <w:r>
+        <w:rPr>
+          <w:rFonts w:ascii="Arial Rounded MT Bold" w:hAnsi="Arial Rounded MT Bold"/>
+          <w:b/>
+          <w:bCs/>
+          <w:lang w:val="es-CO"/>
+        </w:rPr>
+        <w:t>CONCLUSIONES</w:t>
+      </w:r>
+    </w:p>
+    <w:p>
+      <w:pPr>
+        <w:rPr>
+          <w:rFonts w:ascii="Arial Rounded MT Bold" w:hAnsi="Arial Rounded MT Bold"/>
+          <w:lang w:val="es-CO"/>
+        </w:rPr>
+      </w:pPr>
+      <w:r>
         <w:rPr>
           <w:rFonts w:ascii="Arial Rounded MT Bold" w:hAnsi="Arial Rounded MT Bold"/>
           <w:highlight w:val="cyan"/>
           <w:lang w:val="es-CO"/>
         </w:rPr>
-      </w:pPr>
+        <w:t xml:space="preserve">Describir </w:t>
+      </w:r>
       <w:r>
         <w:rPr>
           <w:rFonts w:ascii="Arial Rounded MT Bold" w:hAnsi="Arial Rounded MT Bold"/>
           <w:highlight w:val="cyan"/>
           <w:lang w:val="es-CO"/>
         </w:rPr>
-        <w:t>Listados de asistencia.</w:t>
-      </w:r>
-    </w:p>
-    <w:p>
-      <w:pPr>
-        <w:pStyle w:val="Prrafodelista"/>
-        <w:numPr>
-          <w:ilvl w:val="0"/>
-          <w:numId w:val="2"/>
-        </w:numPr>
+        <w:t xml:space="preserve">las </w:t>
+      </w:r>
+      <w:r>
         <w:rPr>
           <w:rFonts w:ascii="Arial Rounded MT Bold" w:hAnsi="Arial Rounded MT Bold"/>
           <w:highlight w:val="cyan"/>
           <w:lang w:val="es-CO"/>
         </w:rPr>
+        <w:t>conclusiones que considere.</w:t>
+      </w:r>
+    </w:p>
+    <w:p>
+      <w:pPr>
+        <w:rPr>
+          <w:rFonts w:ascii="Arial Rounded MT Bold" w:hAnsi="Arial Rounded MT Bold"/>
+          <w:lang w:val="es-CO"/>
+        </w:rPr>
+      </w:pPr>
+    </w:p>
+    <w:p>
+      <w:pPr>
+        <w:rPr>
+          <w:rFonts w:ascii="Arial Rounded MT Bold" w:hAnsi="Arial Rounded MT Bold"/>
+          <w:b/>
+          <w:bCs/>
+          <w:lang w:val="es-CO"/>
+        </w:rPr>
+      </w:pPr>
+      <w:r>
+        <w:rPr>
+          <w:rFonts w:ascii="Arial Rounded MT Bold" w:hAnsi="Arial Rounded MT Bold"/>
+          <w:b/>
+          <w:bCs/>
+          <w:lang w:val="es-CO"/>
+        </w:rPr>
+        <w:t>RECOMENDACIONES</w:t>
+      </w:r>
+    </w:p>
+    <w:p>
+      <w:pPr>
+        <w:rPr>
+          <w:rFonts w:ascii="Arial Rounded MT Bold" w:hAnsi="Arial Rounded MT Bold"/>
+          <w:lang w:val="es-CO"/>
+        </w:rPr>
       </w:pPr>
       <w:r>
         <w:rPr>
@@ -1317,284 +1141,7 @@
           <w:highlight w:val="cyan"/>
           <w:lang w:val="es-CO"/>
         </w:rPr>
-        <w:t>Presentaciones utilizadas.</w:t>
-      </w:r>
-    </w:p>
-    <w:p>
-      <w:pPr>
-        <w:pStyle w:val="Prrafodelista"/>
-        <w:numPr>
-          <w:ilvl w:val="0"/>
-          <w:numId w:val="2"/>
-        </w:numPr>
-        <w:rPr>
-          <w:rFonts w:ascii="Arial Rounded MT Bold" w:hAnsi="Arial Rounded MT Bold"/>
-          <w:highlight w:val="cyan"/>
-          <w:lang w:val="es-CO"/>
-        </w:rPr>
-      </w:pPr>
-      <w:r>
-        <w:rPr>
-          <w:rFonts w:ascii="Arial Rounded MT Bold" w:hAnsi="Arial Rounded MT Bold"/>
-          <w:highlight w:val="cyan"/>
-          <w:lang w:val="es-CO"/>
-        </w:rPr>
-        <w:t>Registros fotográficos.</w:t>
-      </w:r>
-    </w:p>
-    <w:p>
-      <w:pPr>
-        <w:pStyle w:val="Prrafodelista"/>
-        <w:numPr>
-          <w:ilvl w:val="0"/>
-          <w:numId w:val="2"/>
-        </w:numPr>
-        <w:rPr>
-          <w:rFonts w:ascii="Arial Rounded MT Bold" w:hAnsi="Arial Rounded MT Bold"/>
-          <w:highlight w:val="cyan"/>
-          <w:lang w:val="es-CO"/>
-        </w:rPr>
-      </w:pPr>
-      <w:r>
-        <w:rPr>
-          <w:rFonts w:ascii="Arial Rounded MT Bold" w:hAnsi="Arial Rounded MT Bold"/>
-          <w:highlight w:val="cyan"/>
-          <w:lang w:val="es-CO"/>
-        </w:rPr>
-        <w:t>Correos de convocatoria.</w:t>
-      </w:r>
-    </w:p>
-    <w:p>
-      <w:pPr>
-        <w:pStyle w:val="Prrafodelista"/>
-        <w:numPr>
-          <w:ilvl w:val="0"/>
-          <w:numId w:val="2"/>
-        </w:numPr>
-        <w:rPr>
-          <w:rFonts w:ascii="Arial Rounded MT Bold" w:hAnsi="Arial Rounded MT Bold"/>
-          <w:highlight w:val="cyan"/>
-          <w:lang w:val="es-CO"/>
-        </w:rPr>
-      </w:pPr>
-      <w:r>
-        <w:rPr>
-          <w:rFonts w:ascii="Arial Rounded MT Bold" w:hAnsi="Arial Rounded MT Bold"/>
-          <w:highlight w:val="cyan"/>
-          <w:lang w:val="es-CO"/>
-        </w:rPr>
-        <w:t>Certificados o soportes de participación.</w:t>
-      </w:r>
-    </w:p>
-    <w:p>
-      <w:pPr>
-        <w:rPr>
-          <w:rFonts w:ascii="Arial Rounded MT Bold" w:hAnsi="Arial Rounded MT Bold"/>
-          <w:lang w:val="es-CO"/>
-        </w:rPr>
-      </w:pPr>
-    </w:p>
-    <w:p>
-      <w:pPr>
-        <w:rPr>
-          <w:rFonts w:ascii="Arial Rounded MT Bold" w:hAnsi="Arial Rounded MT Bold"/>
-          <w:lang w:val="es-CO"/>
-        </w:rPr>
-      </w:pPr>
-      <w:r>
-        <w:rPr>
-          <w:rFonts w:ascii="Arial Rounded MT Bold" w:hAnsi="Arial Rounded MT Bold"/>
-          <w:lang w:val="es-CO"/>
-        </w:rPr>
-        <w:t>PLAN DE SOSTENIBILIDAD</w:t>
-      </w:r>
-    </w:p>
-    <w:p>
-      <w:pPr>
-        <w:rPr>
-          <w:rFonts w:ascii="Arial Rounded MT Bold" w:hAnsi="Arial Rounded MT Bold"/>
-          <w:lang w:val="es-CO"/>
-        </w:rPr>
-      </w:pPr>
-      <w:r>
-        <w:rPr>
-          <w:rFonts w:ascii="Arial Rounded MT Bold" w:hAnsi="Arial Rounded MT Bold"/>
-          <w:lang w:val="es-CO"/>
-        </w:rPr>
-        <w:t>Que capacidad instalada se deja:</w:t>
-      </w:r>
-    </w:p>
-    <w:p>
-      <w:pPr>
-        <w:pStyle w:val="Prrafodelista"/>
-        <w:numPr>
-          <w:ilvl w:val="0"/>
-          <w:numId w:val="2"/>
-        </w:numPr>
-        <w:rPr>
-          <w:rFonts w:ascii="Arial Rounded MT Bold" w:hAnsi="Arial Rounded MT Bold"/>
-          <w:highlight w:val="cyan"/>
-          <w:lang w:val="es-CO"/>
-        </w:rPr>
-      </w:pPr>
-      <w:r>
-        <w:rPr>
-          <w:rFonts w:ascii="Arial Rounded MT Bold" w:hAnsi="Arial Rounded MT Bold"/>
-          <w:highlight w:val="cyan"/>
-          <w:lang w:val="es-CO"/>
-        </w:rPr>
-        <w:t xml:space="preserve">Acciones que deben continuar los municipios. </w:t>
-      </w:r>
-    </w:p>
-    <w:p>
-      <w:pPr>
-        <w:pStyle w:val="Prrafodelista"/>
-        <w:numPr>
-          <w:ilvl w:val="0"/>
-          <w:numId w:val="2"/>
-        </w:numPr>
-        <w:rPr>
-          <w:rFonts w:ascii="Arial Rounded MT Bold" w:hAnsi="Arial Rounded MT Bold"/>
-          <w:highlight w:val="cyan"/>
-          <w:lang w:val="es-CO"/>
-        </w:rPr>
-      </w:pPr>
-      <w:r>
-        <w:rPr>
-          <w:rFonts w:ascii="Arial Rounded MT Bold" w:hAnsi="Arial Rounded MT Bold"/>
-          <w:highlight w:val="cyan"/>
-          <w:lang w:val="es-CO"/>
-        </w:rPr>
-        <w:t xml:space="preserve">Responsables. </w:t>
-      </w:r>
-    </w:p>
-    <w:p>
-      <w:pPr>
-        <w:pStyle w:val="Prrafodelista"/>
-        <w:numPr>
-          <w:ilvl w:val="0"/>
-          <w:numId w:val="2"/>
-        </w:numPr>
-        <w:rPr>
-          <w:rFonts w:ascii="Arial Rounded MT Bold" w:hAnsi="Arial Rounded MT Bold"/>
-          <w:highlight w:val="cyan"/>
-          <w:lang w:val="es-CO"/>
-        </w:rPr>
-      </w:pPr>
-      <w:r>
-        <w:rPr>
-          <w:rFonts w:ascii="Arial Rounded MT Bold" w:hAnsi="Arial Rounded MT Bold"/>
-          <w:highlight w:val="cyan"/>
-          <w:lang w:val="es-CO"/>
-        </w:rPr>
-        <w:t xml:space="preserve">Periodicidad de seguimiento. </w:t>
-      </w:r>
-    </w:p>
-    <w:p>
-      <w:pPr>
-        <w:pStyle w:val="Prrafodelista"/>
-        <w:numPr>
-          <w:ilvl w:val="0"/>
-          <w:numId w:val="2"/>
-        </w:numPr>
-        <w:rPr>
-          <w:rFonts w:ascii="Arial Rounded MT Bold" w:hAnsi="Arial Rounded MT Bold"/>
-          <w:highlight w:val="cyan"/>
-          <w:lang w:val="es-CO"/>
-        </w:rPr>
-      </w:pPr>
-      <w:r>
-        <w:rPr>
-          <w:rFonts w:ascii="Arial Rounded MT Bold" w:hAnsi="Arial Rounded MT Bold"/>
-          <w:highlight w:val="cyan"/>
-          <w:lang w:val="es-CO"/>
-        </w:rPr>
-        <w:t>Recomendaciones para la siguiente vigencia.</w:t>
-      </w:r>
-    </w:p>
-    <w:p>
-      <w:pPr>
-        <w:rPr>
-          <w:rFonts w:ascii="Arial Rounded MT Bold" w:hAnsi="Arial Rounded MT Bold"/>
-          <w:lang w:val="es-CO"/>
-        </w:rPr>
-      </w:pPr>
-      <w:r>
-        <w:rPr>
-          <w:rFonts w:ascii="Arial Rounded MT Bold" w:hAnsi="Arial Rounded MT Bold"/>
-          <w:lang w:val="es-CO"/>
-        </w:rPr>
-        <w:t>CONCLUSIONES</w:t>
-      </w:r>
-    </w:p>
-    <w:p>
-      <w:pPr>
-        <w:rPr>
-          <w:rFonts w:ascii="Arial Rounded MT Bold" w:hAnsi="Arial Rounded MT Bold"/>
-          <w:lang w:val="es-CO"/>
-        </w:rPr>
-      </w:pPr>
-      <w:r>
-        <w:rPr>
-          <w:rFonts w:ascii="Arial Rounded MT Bold" w:hAnsi="Arial Rounded MT Bold"/>
-          <w:highlight w:val="cyan"/>
-          <w:lang w:val="es-CO"/>
-        </w:rPr>
-        <w:t xml:space="preserve">Describir </w:t>
-      </w:r>
-      <w:r>
-        <w:rPr>
-          <w:rFonts w:ascii="Arial Rounded MT Bold" w:hAnsi="Arial Rounded MT Bold"/>
-          <w:highlight w:val="cyan"/>
-          <w:lang w:val="es-CO"/>
-        </w:rPr>
-        <w:t xml:space="preserve">las </w:t>
-      </w:r>
-      <w:r>
-        <w:rPr>
-          <w:rFonts w:ascii="Arial Rounded MT Bold" w:hAnsi="Arial Rounded MT Bold"/>
-          <w:highlight w:val="cyan"/>
-          <w:lang w:val="es-CO"/>
-        </w:rPr>
-        <w:t>conclusiones que considere.</w:t>
-      </w:r>
-    </w:p>
-    <w:p>
-      <w:pPr>
-        <w:rPr>
-          <w:rFonts w:ascii="Arial Rounded MT Bold" w:hAnsi="Arial Rounded MT Bold"/>
-          <w:lang w:val="es-CO"/>
-        </w:rPr>
-      </w:pPr>
-    </w:p>
-    <w:p>
-      <w:pPr>
-        <w:rPr>
-          <w:rFonts w:ascii="Arial Rounded MT Bold" w:hAnsi="Arial Rounded MT Bold"/>
-          <w:lang w:val="es-CO"/>
-        </w:rPr>
-      </w:pPr>
-      <w:r>
-        <w:rPr>
-          <w:rFonts w:ascii="Arial Rounded MT Bold" w:hAnsi="Arial Rounded MT Bold"/>
-          <w:lang w:val="es-CO"/>
-        </w:rPr>
-        <w:t>RECOMENDACIONES</w:t>
-      </w:r>
-    </w:p>
-    <w:p>
-      <w:pPr>
-        <w:rPr>
-          <w:rFonts w:ascii="Arial Rounded MT Bold" w:hAnsi="Arial Rounded MT Bold"/>
-          <w:lang w:val="es-CO"/>
-        </w:rPr>
-      </w:pPr>
-      <w:r>
-        <w:rPr>
-          <w:rFonts w:ascii="Arial Rounded MT Bold" w:hAnsi="Arial Rounded MT Bold"/>
-          <w:highlight w:val="cyan"/>
-          <w:lang w:val="es-CO"/>
-        </w:rPr>
+        <w:lastRenderedPageBreak/>
         <w:t xml:space="preserve">Describir </w:t>
       </w:r>
       <w:r>
@@ -1707,14 +1254,6 @@
               </w:rPr>
               <w:t>NOMBRE</w:t>
             </w:r>
-            <w:r>
-              <w:rPr>
-                <w:rFonts w:ascii="Arial Rounded MT Bold" w:hAnsi="Arial Rounded MT Bold"/>
-                <w:highlight w:val="yellow"/>
-                <w:lang w:val="es-CO"/>
-              </w:rPr>
-              <w:t xml:space="preserve"> PROFESIONAL</w:t>
-            </w:r>
           </w:p>
         </w:tc>
         <w:tc>
@@ -1738,14 +1277,6 @@
                 <w:lang w:val="es-CO"/>
               </w:rPr>
               <w:t>CARGO</w:t>
-            </w:r>
-            <w:r>
-              <w:rPr>
-                <w:rFonts w:ascii="Arial Rounded MT Bold" w:hAnsi="Arial Rounded MT Bold"/>
-                <w:highlight w:val="yellow"/>
-                <w:lang w:val="es-CO"/>
-              </w:rPr>
-              <w:t xml:space="preserve"> / ROL</w:t>
             </w:r>
           </w:p>
         </w:tc>
@@ -1882,7 +1413,7 @@
 </file>
 
 <file path=word/endnotes.xml><?xml version="1.0" encoding="utf-8"?>
-<w:endnotes xmlns:wpc="http://schemas.microsoft.com/office/word/2010/wordprocessingCanvas" xmlns:cx="http://schemas.microsoft.com/office/drawing/2014/chartex" xmlns:cx1="http://schemas.microsoft.com/office/drawing/2015/9/8/chartex" xmlns:cx2="http://schemas.microsoft.com/office/drawing/2015/10/21/chartex" xmlns:cx3="http://schemas.microsoft.com/office/drawing/2016/5/9/chartex" xmlns:cx4="http://schemas.microsoft.com/office/drawing/2016/5/10/chartex" xmlns:cx5="http://schemas.microsoft.com/office/drawing/2016/5/11/chartex" xmlns:cx6="http://schemas.microsoft.com/office/drawing/2016/5/12/chartex" xmlns:cx7="http://schemas.microsoft.com/office/drawing/2016/5/13/chartex" xmlns:cx8="http://schemas.microsoft.com/office/drawing/2016/5/14/chartex" xmlns:mc="http://schemas.openxmlformats.org/markup-compatibility/2006" xmlns:aink="http://schemas.microsoft.com/office/drawing/2016/ink" xmlns:am3d="http://schemas.microsoft.com/office/drawing/2017/model3d" xmlns:o="urn:schemas-microsoft-com:office:office" xmlns:oel="http://schemas.microsoft.com/office/2019/extlst" xmlns:r="http://schemas.openxmlformats.org/officeDocument/2006/relationships" xmlns:m="http://schemas.openxmlformats.org/officeDocument/2006/math" xmlns:v="urn:schemas-microsoft-com:vml" xmlns:wp14="http://schemas.microsoft.com/office/word/2010/wordprocessingDrawing" xmlns:wp="http://schemas.openxmlformats.org/drawingml/2006/wordprocessingDrawing" xmlns:w10="urn:schemas-microsoft-com:office:word" xmlns:w="http://schemas.openxmlformats.org/wordprocessingml/2006/main" xmlns:w14="http://schemas.microsoft.com/office/word/2010/wordml" xmlns:w15="http://schemas.microsoft.com/office/word/2012/wordml" xmlns:w16cex="http://schemas.microsoft.com/office/word/2018/wordml/cex" xmlns:w16cid="http://schemas.microsoft.com/office/word/2016/wordml/cid" xmlns:w16="http://schemas.microsoft.com/office/word/2018/wordml" xmlns:w16du="http://schemas.microsoft.com/office/word/2023/wordml/word16du" xmlns:w16sdtdh="http://schemas.microsoft.com/office/word/2020/wordml/sdtdatahash" xmlns:w16sdtfl="http://schemas.microsoft.com/office/word/2024/wordml/sdtformatlock" xmlns:w16se="http://schemas.microsoft.com/office/word/2015/wordml/symex" xmlns:wpg="http://schemas.microsoft.com/office/word/2010/wordprocessingGroup" xmlns:wpi="http://schemas.microsoft.com/office/word/2010/wordprocessingInk" xmlns:wne="http://schemas.microsoft.com/office/word/2006/wordml" xmlns:wps="http://schemas.microsoft.com/office/word/2010/wordprocessingShape" mc:Ignorable="w14 w15 w16se w16cid w16 w16cex w16sdtdh w16sdtfl w16du wp14">
+<w:endnotes xmlns:wpc="http://schemas.microsoft.com/office/word/2010/wordprocessingCanvas" xmlns:cx="http://schemas.microsoft.com/office/drawing/2014/chartex" xmlns:cx1="http://schemas.microsoft.com/office/drawing/2015/9/8/chartex" xmlns:cx2="http://schemas.microsoft.com/office/drawing/2015/10/21/chartex" xmlns:cx3="http://schemas.microsoft.com/office/drawing/2016/5/9/chartex" xmlns:cx4="http://schemas.microsoft.com/office/drawing/2016/5/10/chartex" xmlns:cx5="http://schemas.microsoft.com/office/drawing/2016/5/11/chartex" xmlns:cx6="http://schemas.microsoft.com/office/drawing/2016/5/12/chartex" xmlns:cx7="http://schemas.microsoft.com/office/drawing/2016/5/13/chartex" xmlns:cx8="http://schemas.microsoft.com/office/drawing/2016/5/14/chartex" xmlns:mc="http://schemas.openxmlformats.org/markup-compatibility/2006" xmlns:aink="http://schemas.microsoft.com/office/drawing/2016/ink" xmlns:am3d="http://schemas.microsoft.com/office/drawing/2017/model3d" xmlns:o="urn:schemas-microsoft-com:office:office" xmlns:r="http://schemas.openxmlformats.org/officeDocument/2006/relationships" xmlns:m="http://schemas.openxmlformats.org/officeDocument/2006/math" xmlns:v="urn:schemas-microsoft-com:vml" xmlns:wp14="http://schemas.microsoft.com/office/word/2010/wordprocessingDrawing" xmlns:wp="http://schemas.openxmlformats.org/drawingml/2006/wordprocessingDrawing" xmlns:w10="urn:schemas-microsoft-com:office:word" xmlns:w="http://schemas.openxmlformats.org/wordprocessingml/2006/main" xmlns:w14="http://schemas.microsoft.com/office/word/2010/wordml" xmlns:w15="http://schemas.microsoft.com/office/word/2012/wordml" xmlns:w16cex="http://schemas.microsoft.com/office/word/2018/wordml/cex" xmlns:w16cid="http://schemas.microsoft.com/office/word/2016/wordml/cid" xmlns:w16="http://schemas.microsoft.com/office/word/2018/wordml" xmlns:w16sdtdh="http://schemas.microsoft.com/office/word/2020/wordml/sdtdatahash" xmlns:w16se="http://schemas.microsoft.com/office/word/2015/wordml/symex" xmlns:wpg="http://schemas.microsoft.com/office/word/2010/wordprocessingGroup" xmlns:wpi="http://schemas.microsoft.com/office/word/2010/wordprocessingInk" xmlns:wne="http://schemas.microsoft.com/office/word/2006/wordml" xmlns:wps="http://schemas.microsoft.com/office/word/2010/wordprocessingShape" mc:Ignorable="w14 w15 w16se w16cid w16 w16cex w16sdtdh wp14">
   <w:endnote w:type="separator" w:id="-1">
     <w:p>
       <w:pPr>
@@ -1907,7 +1438,7 @@
 </file>
 
 <file path=word/footnotes.xml><?xml version="1.0" encoding="utf-8"?>
-<w:footnotes xmlns:wpc="http://schemas.microsoft.com/office/word/2010/wordprocessingCanvas" xmlns:cx="http://schemas.microsoft.com/office/drawing/2014/chartex" xmlns:cx1="http://schemas.microsoft.com/office/drawing/2015/9/8/chartex" xmlns:cx2="http://schemas.microsoft.com/office/drawing/2015/10/21/chartex" xmlns:cx3="http://schemas.microsoft.com/office/drawing/2016/5/9/chartex" xmlns:cx4="http://schemas.microsoft.com/office/drawing/2016/5/10/chartex" xmlns:cx5="http://schemas.microsoft.com/office/drawing/2016/5/11/chartex" xmlns:cx6="http://schemas.microsoft.com/office/drawing/2016/5/12/chartex" xmlns:cx7="http://schemas.microsoft.com/office/drawing/2016/5/13/chartex" xmlns:cx8="http://schemas.microsoft.com/office/drawing/2016/5/14/chartex" xmlns:mc="http://schemas.openxmlformats.org/markup-compatibility/2006" xmlns:aink="http://schemas.microsoft.com/office/drawing/2016/ink" xmlns:am3d="http://schemas.microsoft.com/office/drawing/2017/model3d" xmlns:o="urn:schemas-microsoft-com:office:office" xmlns:oel="http://schemas.microsoft.com/office/2019/extlst" xmlns:r="http://schemas.openxmlformats.org/officeDocument/2006/relationships" xmlns:m="http://schemas.openxmlformats.org/officeDocument/2006/math" xmlns:v="urn:schemas-microsoft-com:vml" xmlns:wp14="http://schemas.microsoft.com/office/word/2010/wordprocessingDrawing" xmlns:wp="http://schemas.openxmlformats.org/drawingml/2006/wordprocessingDrawing" xmlns:w10="urn:schemas-microsoft-com:office:word" xmlns:w="http://schemas.openxmlformats.org/wordprocessingml/2006/main" xmlns:w14="http://schemas.microsoft.com/office/word/2010/wordml" xmlns:w15="http://schemas.microsoft.com/office/word/2012/wordml" xmlns:w16cex="http://schemas.microsoft.com/office/word/2018/wordml/cex" xmlns:w16cid="http://schemas.microsoft.com/office/word/2016/wordml/cid" xmlns:w16="http://schemas.microsoft.com/office/word/2018/wordml" xmlns:w16du="http://schemas.microsoft.com/office/word/2023/wordml/word16du" xmlns:w16sdtdh="http://schemas.microsoft.com/office/word/2020/wordml/sdtdatahash" xmlns:w16sdtfl="http://schemas.microsoft.com/office/word/2024/wordml/sdtformatlock" xmlns:w16se="http://schemas.microsoft.com/office/word/2015/wordml/symex" xmlns:wpg="http://schemas.microsoft.com/office/word/2010/wordprocessingGroup" xmlns:wpi="http://schemas.microsoft.com/office/word/2010/wordprocessingInk" xmlns:wne="http://schemas.microsoft.com/office/word/2006/wordml" xmlns:wps="http://schemas.microsoft.com/office/word/2010/wordprocessingShape" mc:Ignorable="w14 w15 w16se w16cid w16 w16cex w16sdtdh w16sdtfl w16du wp14">
+<w:footnotes xmlns:wpc="http://schemas.microsoft.com/office/word/2010/wordprocessingCanvas" xmlns:cx="http://schemas.microsoft.com/office/drawing/2014/chartex" xmlns:cx1="http://schemas.microsoft.com/office/drawing/2015/9/8/chartex" xmlns:cx2="http://schemas.microsoft.com/office/drawing/2015/10/21/chartex" xmlns:cx3="http://schemas.microsoft.com/office/drawing/2016/5/9/chartex" xmlns:cx4="http://schemas.microsoft.com/office/drawing/2016/5/10/chartex" xmlns:cx5="http://schemas.microsoft.com/office/drawing/2016/5/11/chartex" xmlns:cx6="http://schemas.microsoft.com/office/drawing/2016/5/12/chartex" xmlns:cx7="http://schemas.microsoft.com/office/drawing/2016/5/13/chartex" xmlns:cx8="http://schemas.microsoft.com/office/drawing/2016/5/14/chartex" xmlns:mc="http://schemas.openxmlformats.org/markup-compatibility/2006" xmlns:aink="http://schemas.microsoft.com/office/drawing/2016/ink" xmlns:am3d="http://schemas.microsoft.com/office/drawing/2017/model3d" xmlns:o="urn:schemas-microsoft-com:office:office" xmlns:r="http://schemas.openxmlformats.org/officeDocument/2006/relationships" xmlns:m="http://schemas.openxmlformats.org/officeDocument/2006/math" xmlns:v="urn:schemas-microsoft-com:vml" xmlns:wp14="http://schemas.microsoft.com/office/word/2010/wordprocessingDrawing" xmlns:wp="http://schemas.openxmlformats.org/drawingml/2006/wordprocessingDrawing" xmlns:w10="urn:schemas-microsoft-com:office:word" xmlns:w="http://schemas.openxmlformats.org/wordprocessingml/2006/main" xmlns:w14="http://schemas.microsoft.com/office/word/2010/wordml" xmlns:w15="http://schemas.microsoft.com/office/word/2012/wordml" xmlns:w16cex="http://schemas.microsoft.com/office/word/2018/wordml/cex" xmlns:w16cid="http://schemas.microsoft.com/office/word/2016/wordml/cid" xmlns:w16="http://schemas.microsoft.com/office/word/2018/wordml" xmlns:w16sdtdh="http://schemas.microsoft.com/office/word/2020/wordml/sdtdatahash" xmlns:w16se="http://schemas.microsoft.com/office/word/2015/wordml/symex" xmlns:wpg="http://schemas.microsoft.com/office/word/2010/wordprocessingGroup" xmlns:wpi="http://schemas.microsoft.com/office/word/2010/wordprocessingInk" xmlns:wne="http://schemas.microsoft.com/office/word/2006/wordml" xmlns:wps="http://schemas.microsoft.com/office/word/2010/wordprocessingShape" mc:Ignorable="w14 w15 w16se w16cid w16 w16cex w16sdtdh wp14">
   <w:footnote w:type="separator" w:id="-1">
     <w:p>
       <w:pPr>
@@ -1932,7 +1463,7 @@
 </file>
 
 <file path=word/header1.xml><?xml version="1.0" encoding="utf-8"?>
-<w:hdr xmlns:wpc="http://schemas.microsoft.com/office/word/2010/wordprocessingCanvas" xmlns:cx="http://schemas.microsoft.com/office/drawing/2014/chartex" xmlns:cx1="http://schemas.microsoft.com/office/drawing/2015/9/8/chartex" xmlns:cx2="http://schemas.microsoft.com/office/drawing/2015/10/21/chartex" xmlns:cx3="http://schemas.microsoft.com/office/drawing/2016/5/9/chartex" xmlns:cx4="http://schemas.microsoft.com/office/drawing/2016/5/10/chartex" xmlns:cx5="http://schemas.microsoft.com/office/drawing/2016/5/11/chartex" xmlns:cx6="http://schemas.microsoft.com/office/drawing/2016/5/12/chartex" xmlns:cx7="http://schemas.microsoft.com/office/drawing/2016/5/13/chartex" xmlns:cx8="http://schemas.microsoft.com/office/drawing/2016/5/14/chartex" xmlns:mc="http://schemas.openxmlformats.org/markup-compatibility/2006" xmlns:aink="http://schemas.microsoft.com/office/drawing/2016/ink" xmlns:am3d="http://schemas.microsoft.com/office/drawing/2017/model3d" xmlns:o="urn:schemas-microsoft-com:office:office" xmlns:oel="http://schemas.microsoft.com/office/2019/extlst" xmlns:r="http://schemas.openxmlformats.org/officeDocument/2006/relationships" xmlns:m="http://schemas.openxmlformats.org/officeDocument/2006/math" xmlns:v="urn:schemas-microsoft-com:vml" xmlns:wp14="http://schemas.microsoft.com/office/word/2010/wordprocessingDrawing" xmlns:wp="http://schemas.openxmlformats.org/drawingml/2006/wordprocessingDrawing" xmlns:w10="urn:schemas-microsoft-com:office:word" xmlns:w="http://schemas.openxmlformats.org/wordprocessingml/2006/main" xmlns:w14="http://schemas.microsoft.com/office/word/2010/wordml" xmlns:w15="http://schemas.microsoft.com/office/word/2012/wordml" xmlns:w16cex="http://schemas.microsoft.com/office/word/2018/wordml/cex" xmlns:w16cid="http://schemas.microsoft.com/office/word/2016/wordml/cid" xmlns:w16="http://schemas.microsoft.com/office/word/2018/wordml" xmlns:w16du="http://schemas.microsoft.com/office/word/2023/wordml/word16du" xmlns:w16sdtdh="http://schemas.microsoft.com/office/word/2020/wordml/sdtdatahash" xmlns:w16sdtfl="http://schemas.microsoft.com/office/word/2024/wordml/sdtformatlock" xmlns:w16se="http://schemas.microsoft.com/office/word/2015/wordml/symex" xmlns:wpg="http://schemas.microsoft.com/office/word/2010/wordprocessingGroup" xmlns:wpi="http://schemas.microsoft.com/office/word/2010/wordprocessingInk" xmlns:wne="http://schemas.microsoft.com/office/word/2006/wordml" xmlns:wps="http://schemas.microsoft.com/office/word/2010/wordprocessingShape" mc:Ignorable="w14 w15 w16se w16cid w16 w16cex w16sdtdh w16sdtfl w16du wp14">
+<w:hdr xmlns:wpc="http://schemas.microsoft.com/office/word/2010/wordprocessingCanvas" xmlns:cx="http://schemas.microsoft.com/office/drawing/2014/chartex" xmlns:cx1="http://schemas.microsoft.com/office/drawing/2015/9/8/chartex" xmlns:cx2="http://schemas.microsoft.com/office/drawing/2015/10/21/chartex" xmlns:cx3="http://schemas.microsoft.com/office/drawing/2016/5/9/chartex" xmlns:cx4="http://schemas.microsoft.com/office/drawing/2016/5/10/chartex" xmlns:cx5="http://schemas.microsoft.com/office/drawing/2016/5/11/chartex" xmlns:cx6="http://schemas.microsoft.com/office/drawing/2016/5/12/chartex" xmlns:cx7="http://schemas.microsoft.com/office/drawing/2016/5/13/chartex" xmlns:cx8="http://schemas.microsoft.com/office/drawing/2016/5/14/chartex" xmlns:mc="http://schemas.openxmlformats.org/markup-compatibility/2006" xmlns:aink="http://schemas.microsoft.com/office/drawing/2016/ink" xmlns:am3d="http://schemas.microsoft.com/office/drawing/2017/model3d" xmlns:o="urn:schemas-microsoft-com:office:office" xmlns:r="http://schemas.openxmlformats.org/officeDocument/2006/relationships" xmlns:m="http://schemas.openxmlformats.org/officeDocument/2006/math" xmlns:v="urn:schemas-microsoft-com:vml" xmlns:wp14="http://schemas.microsoft.com/office/word/2010/wordprocessingDrawing" xmlns:wp="http://schemas.openxmlformats.org/drawingml/2006/wordprocessingDrawing" xmlns:w10="urn:schemas-microsoft-com:office:word" xmlns:w="http://schemas.openxmlformats.org/wordprocessingml/2006/main" xmlns:w14="http://schemas.microsoft.com/office/word/2010/wordml" xmlns:w15="http://schemas.microsoft.com/office/word/2012/wordml" xmlns:w16cex="http://schemas.microsoft.com/office/word/2018/wordml/cex" xmlns:w16cid="http://schemas.microsoft.com/office/word/2016/wordml/cid" xmlns:w16="http://schemas.microsoft.com/office/word/2018/wordml" xmlns:w16sdtdh="http://schemas.microsoft.com/office/word/2020/wordml/sdtdatahash" xmlns:w16se="http://schemas.microsoft.com/office/word/2015/wordml/symex" xmlns:wpg="http://schemas.microsoft.com/office/word/2010/wordprocessingGroup" xmlns:wpi="http://schemas.microsoft.com/office/word/2010/wordprocessingInk" xmlns:wne="http://schemas.microsoft.com/office/word/2006/wordml" xmlns:wps="http://schemas.microsoft.com/office/word/2010/wordprocessingShape" mc:Ignorable="w14 w15 w16se w16cid w16 w16cex w16sdtdh wp14">
   <w:p>
     <w:pPr>
       <w:pStyle w:val="Encabezado"/>
@@ -2289,7 +1820,7 @@
 </file>
 
 <file path=word/numbering.xml><?xml version="1.0" encoding="utf-8"?>
-<w:numbering xmlns:wpc="http://schemas.microsoft.com/office/word/2010/wordprocessingCanvas" xmlns:cx="http://schemas.microsoft.com/office/drawing/2014/chartex" xmlns:cx1="http://schemas.microsoft.com/office/drawing/2015/9/8/chartex" xmlns:cx2="http://schemas.microsoft.com/office/drawing/2015/10/21/chartex" xmlns:cx3="http://schemas.microsoft.com/office/drawing/2016/5/9/chartex" xmlns:cx4="http://schemas.microsoft.com/office/drawing/2016/5/10/chartex" xmlns:cx5="http://schemas.microsoft.com/office/drawing/2016/5/11/chartex" xmlns:cx6="http://schemas.microsoft.com/office/drawing/2016/5/12/chartex" xmlns:cx7="http://schemas.microsoft.com/office/drawing/2016/5/13/chartex" xmlns:cx8="http://schemas.microsoft.com/office/drawing/2016/5/14/chartex" xmlns:mc="http://schemas.openxmlformats.org/markup-compatibility/2006" xmlns:aink="http://schemas.microsoft.com/office/drawing/2016/ink" xmlns:am3d="http://schemas.microsoft.com/office/drawing/2017/model3d" xmlns:o="urn:schemas-microsoft-com:office:office" xmlns:oel="http://schemas.microsoft.com/office/2019/extlst" xmlns:r="http://schemas.openxmlformats.org/officeDocument/2006/relationships" xmlns:m="http://schemas.openxmlformats.org/officeDocument/2006/math" xmlns:v="urn:schemas-microsoft-com:vml" xmlns:wp14="http://schemas.microsoft.com/office/word/2010/wordprocessingDrawing" xmlns:wp="http://schemas.openxmlformats.org/drawingml/2006/wordprocessingDrawing" xmlns:w10="urn:schemas-microsoft-com:office:word" xmlns:w="http://schemas.openxmlformats.org/wordprocessingml/2006/main" xmlns:w14="http://schemas.microsoft.com/office/word/2010/wordml" xmlns:w15="http://schemas.microsoft.com/office/word/2012/wordml" xmlns:w16cex="http://schemas.microsoft.com/office/word/2018/wordml/cex" xmlns:w16cid="http://schemas.microsoft.com/office/word/2016/wordml/cid" xmlns:w16="http://schemas.microsoft.com/office/word/2018/wordml" xmlns:w16du="http://schemas.microsoft.com/office/word/2023/wordml/word16du" xmlns:w16sdtdh="http://schemas.microsoft.com/office/word/2020/wordml/sdtdatahash" xmlns:w16sdtfl="http://schemas.microsoft.com/office/word/2024/wordml/sdtformatlock" xmlns:w16se="http://schemas.microsoft.com/office/word/2015/wordml/symex" xmlns:wpg="http://schemas.microsoft.com/office/word/2010/wordprocessingGroup" xmlns:wpi="http://schemas.microsoft.com/office/word/2010/wordprocessingInk" xmlns:wne="http://schemas.microsoft.com/office/word/2006/wordml" xmlns:wps="http://schemas.microsoft.com/office/word/2010/wordprocessingShape" mc:Ignorable="w14 w15 w16se w16cid w16 w16cex w16sdtdh w16sdtfl w16du wp14">
+<w:numbering xmlns:wpc="http://schemas.microsoft.com/office/word/2010/wordprocessingCanvas" xmlns:cx="http://schemas.microsoft.com/office/drawing/2014/chartex" xmlns:cx1="http://schemas.microsoft.com/office/drawing/2015/9/8/chartex" xmlns:cx2="http://schemas.microsoft.com/office/drawing/2015/10/21/chartex" xmlns:cx3="http://schemas.microsoft.com/office/drawing/2016/5/9/chartex" xmlns:cx4="http://schemas.microsoft.com/office/drawing/2016/5/10/chartex" xmlns:cx5="http://schemas.microsoft.com/office/drawing/2016/5/11/chartex" xmlns:cx6="http://schemas.microsoft.com/office/drawing/2016/5/12/chartex" xmlns:cx7="http://schemas.microsoft.com/office/drawing/2016/5/13/chartex" xmlns:cx8="http://schemas.microsoft.com/office/drawing/2016/5/14/chartex" xmlns:mc="http://schemas.openxmlformats.org/markup-compatibility/2006" xmlns:aink="http://schemas.microsoft.com/office/drawing/2016/ink" xmlns:am3d="http://schemas.microsoft.com/office/drawing/2017/model3d" xmlns:o="urn:schemas-microsoft-com:office:office" xmlns:r="http://schemas.openxmlformats.org/officeDocument/2006/relationships" xmlns:m="http://schemas.openxmlformats.org/officeDocument/2006/math" xmlns:v="urn:schemas-microsoft-com:vml" xmlns:wp14="http://schemas.microsoft.com/office/word/2010/wordprocessingDrawing" xmlns:wp="http://schemas.openxmlformats.org/drawingml/2006/wordprocessingDrawing" xmlns:w10="urn:schemas-microsoft-com:office:word" xmlns:w="http://schemas.openxmlformats.org/wordprocessingml/2006/main" xmlns:w14="http://schemas.microsoft.com/office/word/2010/wordml" xmlns:w15="http://schemas.microsoft.com/office/word/2012/wordml" xmlns:w16cex="http://schemas.microsoft.com/office/word/2018/wordml/cex" xmlns:w16cid="http://schemas.microsoft.com/office/word/2016/wordml/cid" xmlns:w16="http://schemas.microsoft.com/office/word/2018/wordml" xmlns:w16sdtdh="http://schemas.microsoft.com/office/word/2020/wordml/sdtdatahash" xmlns:w16se="http://schemas.microsoft.com/office/word/2015/wordml/symex" xmlns:wpg="http://schemas.microsoft.com/office/word/2010/wordprocessingGroup" xmlns:wpi="http://schemas.microsoft.com/office/word/2010/wordprocessingInk" xmlns:wne="http://schemas.microsoft.com/office/word/2006/wordml" xmlns:wps="http://schemas.microsoft.com/office/word/2010/wordprocessingShape" mc:Ignorable="w14 w15 w16se w16cid w16 w16cex w16sdtdh wp14">
   <w:abstractNum w:abstractNumId="0" w15:restartNumberingAfterBreak="0">
     <w:nsid w:val="1D296F69"/>
     <w:multiLevelType w:val="hybridMultilevel"/>
@@ -2663,20 +2194,20 @@
       </w:rPr>
     </w:lvl>
   </w:abstractNum>
-  <w:num w:numId="1" w16cid:durableId="1867451266">
+  <w:num w:numId="1">
     <w:abstractNumId w:val="0"/>
   </w:num>
-  <w:num w:numId="2" w16cid:durableId="2083133449">
+  <w:num w:numId="2">
     <w:abstractNumId w:val="2"/>
   </w:num>
-  <w:num w:numId="3" w16cid:durableId="1825778664">
+  <w:num w:numId="3">
     <w:abstractNumId w:val="1"/>
   </w:num>
 </w:numbering>
 </file>
 
 <file path=word/styles.xml><?xml version="1.0" encoding="utf-8"?>
-<w:styles xmlns:mc="http://schemas.openxmlformats.org/markup-compatibility/2006" xmlns:r="http://schemas.openxmlformats.org/officeDocument/2006/relationships" xmlns:w="http://schemas.openxmlformats.org/wordprocessingml/2006/main" xmlns:w14="http://schemas.microsoft.com/office/word/2010/wordml" xmlns:w15="http://schemas.microsoft.com/office/word/2012/wordml" xmlns:w16cex="http://schemas.microsoft.com/office/word/2018/wordml/cex" xmlns:w16cid="http://schemas.microsoft.com/office/word/2016/wordml/cid" xmlns:w16="http://schemas.microsoft.com/office/word/2018/wordml" xmlns:w16du="http://schemas.microsoft.com/office/word/2023/wordml/word16du" xmlns:w16sdtdh="http://schemas.microsoft.com/office/word/2020/wordml/sdtdatahash" xmlns:w16sdtfl="http://schemas.microsoft.com/office/word/2024/wordml/sdtformatlock" xmlns:w16se="http://schemas.microsoft.com/office/word/2015/wordml/symex" mc:Ignorable="w14 w15 w16se w16cid w16 w16cex w16sdtdh w16sdtfl w16du">
+<w:styles xmlns:mc="http://schemas.openxmlformats.org/markup-compatibility/2006" xmlns:r="http://schemas.openxmlformats.org/officeDocument/2006/relationships" xmlns:w="http://schemas.openxmlformats.org/wordprocessingml/2006/main" xmlns:w14="http://schemas.microsoft.com/office/word/2010/wordml" xmlns:w15="http://schemas.microsoft.com/office/word/2012/wordml" xmlns:w16cex="http://schemas.microsoft.com/office/word/2018/wordml/cex" xmlns:w16cid="http://schemas.microsoft.com/office/word/2016/wordml/cid" xmlns:w16="http://schemas.microsoft.com/office/word/2018/wordml" xmlns:w16sdtdh="http://schemas.microsoft.com/office/word/2020/wordml/sdtdatahash" xmlns:w16se="http://schemas.microsoft.com/office/word/2015/wordml/symex" mc:Ignorable="w14 w15 w16se w16cid w16 w16cex w16sdtdh">
   <w:docDefaults>
     <w:rPrDefault>
       <w:rPr>

</xml_diff>